<commit_message>
Set explicit heading fonts/sizes per template; refresh TOC page numbers
Co-Authored-By: Claude Sonnet 5.5 <noreply@anthropic.com>
Claude-Session: https://claude.ai/code/session_016h7Migm1KSaZtebzBW1y8f
</commit_message>
<xml_diff>
--- a/深度学习应用开发课程标准_排版后.docx
+++ b/深度学习应用开发课程标准_排版后.docx
@@ -2426,6 +2426,11 @@
       </w:pPr>
       <w:bookmarkStart w:id="1" w:name="_Toc241007374"/>
       <w:r>
+        <w:rPr>
+          <w:rFonts w:ascii="方正黑体_GBK" w:hAnsi="方正黑体_GBK" w:eastAsia="方正黑体_GBK" w:cs="方正黑体_GBK"/>
+          <w:sz w:val="32"/>
+          <w:szCs w:val="32"/>
+        </w:rPr>
         <w:t>一、课程基本信息</w:t>
       </w:r>
       <w:bookmarkEnd w:id="1"/>
@@ -4378,6 +4383,11 @@
       </w:pPr>
       <w:bookmarkStart w:id="2" w:name="_Toc241007375"/>
       <w:r>
+        <w:rPr>
+          <w:rFonts w:ascii="方正黑体_GBK" w:hAnsi="方正黑体_GBK" w:eastAsia="方正黑体_GBK" w:cs="方正黑体_GBK"/>
+          <w:sz w:val="32"/>
+          <w:szCs w:val="32"/>
+        </w:rPr>
         <w:t>二、课程定位</w:t>
       </w:r>
       <w:bookmarkEnd w:id="2"/>
@@ -4389,6 +4399,11 @@
       </w:pPr>
       <w:bookmarkStart w:id="3" w:name="_Toc241007376"/>
       <w:r>
+        <w:rPr>
+          <w:rFonts w:ascii="方正楷体_GBK" w:hAnsi="方正楷体_GBK" w:eastAsia="方正楷体_GBK" w:cs="方正楷体_GBK"/>
+          <w:sz w:val="32"/>
+          <w:szCs w:val="32"/>
+        </w:rPr>
         <w:t>（一）课程定位</w:t>
       </w:r>
       <w:bookmarkEnd w:id="3"/>
@@ -4650,6 +4665,11 @@
       </w:pPr>
       <w:bookmarkStart w:id="4" w:name="_Toc241007377"/>
       <w:r>
+        <w:rPr>
+          <w:rFonts w:ascii="方正楷体_GBK" w:hAnsi="方正楷体_GBK" w:eastAsia="方正楷体_GBK" w:cs="方正楷体_GBK"/>
+          <w:sz w:val="32"/>
+          <w:szCs w:val="32"/>
+        </w:rPr>
         <w:t>（二）课程性质</w:t>
       </w:r>
       <w:bookmarkEnd w:id="4"/>
@@ -4751,6 +4771,11 @@
       </w:pPr>
       <w:bookmarkStart w:id="5" w:name="_Toc241007378"/>
       <w:r>
+        <w:rPr>
+          <w:rFonts w:ascii="方正黑体_GBK" w:hAnsi="方正黑体_GBK" w:eastAsia="方正黑体_GBK" w:cs="方正黑体_GBK"/>
+          <w:sz w:val="32"/>
+          <w:szCs w:val="32"/>
+        </w:rPr>
         <w:t>三、课程任务</w:t>
       </w:r>
       <w:bookmarkEnd w:id="5"/>
@@ -4980,6 +5005,11 @@
       </w:pPr>
       <w:bookmarkStart w:id="6" w:name="_Toc241007379"/>
       <w:r>
+        <w:rPr>
+          <w:rFonts w:ascii="方正黑体_GBK" w:hAnsi="方正黑体_GBK" w:eastAsia="方正黑体_GBK" w:cs="方正黑体_GBK"/>
+          <w:sz w:val="32"/>
+          <w:szCs w:val="32"/>
+        </w:rPr>
         <w:t>四、课程目标</w:t>
       </w:r>
       <w:bookmarkEnd w:id="6"/>
@@ -4991,6 +5021,11 @@
       </w:pPr>
       <w:bookmarkStart w:id="7" w:name="_Toc241007380"/>
       <w:r>
+        <w:rPr>
+          <w:rFonts w:ascii="方正楷体_GBK" w:hAnsi="方正楷体_GBK" w:eastAsia="方正楷体_GBK" w:cs="方正楷体_GBK"/>
+          <w:sz w:val="32"/>
+          <w:szCs w:val="32"/>
+        </w:rPr>
         <w:t>（一）知识目标</w:t>
       </w:r>
       <w:bookmarkEnd w:id="7"/>
@@ -5216,6 +5251,11 @@
       </w:pPr>
       <w:bookmarkStart w:id="8" w:name="_Toc241007381"/>
       <w:r>
+        <w:rPr>
+          <w:rFonts w:ascii="方正楷体_GBK" w:hAnsi="方正楷体_GBK" w:eastAsia="方正楷体_GBK" w:cs="方正楷体_GBK"/>
+          <w:sz w:val="32"/>
+          <w:szCs w:val="32"/>
+        </w:rPr>
         <w:t>（二）能力（技能）目标</w:t>
       </w:r>
       <w:bookmarkEnd w:id="8"/>
@@ -5400,10 +5440,20 @@
         <w:spacing w:before="0" w:beforeAutospacing="0" w:afterAutospacing="0"/>
       </w:pPr>
       <w:r>
+        <w:rPr>
+          <w:rFonts w:ascii="方正楷体_GBK" w:hAnsi="方正楷体_GBK" w:eastAsia="方正楷体_GBK" w:cs="方正楷体_GBK"/>
+          <w:sz w:val="32"/>
+          <w:szCs w:val="32"/>
+        </w:rPr>
         <w:tab/>
       </w:r>
       <w:bookmarkStart w:id="9" w:name="_Toc241007382"/>
       <w:r>
+        <w:rPr>
+          <w:rFonts w:ascii="方正楷体_GBK" w:hAnsi="方正楷体_GBK" w:eastAsia="方正楷体_GBK" w:cs="方正楷体_GBK"/>
+          <w:sz w:val="32"/>
+          <w:szCs w:val="32"/>
+        </w:rPr>
         <w:t>（三）素质目标</w:t>
       </w:r>
       <w:bookmarkEnd w:id="9"/>
@@ -5519,6 +5569,11 @@
       </w:pPr>
       <w:bookmarkStart w:id="10" w:name="_Toc241007383"/>
       <w:r>
+        <w:rPr>
+          <w:rFonts w:ascii="方正黑体_GBK" w:hAnsi="方正黑体_GBK" w:eastAsia="方正黑体_GBK" w:cs="方正黑体_GBK"/>
+          <w:sz w:val="32"/>
+          <w:szCs w:val="32"/>
+        </w:rPr>
         <w:t>五、课程内容与学时分配</w:t>
       </w:r>
       <w:bookmarkEnd w:id="10"/>
@@ -9744,6 +9799,11 @@
       </w:pPr>
       <w:bookmarkStart w:id="11" w:name="_Toc241007384"/>
       <w:r>
+        <w:rPr>
+          <w:rFonts w:ascii="方正黑体_GBK" w:hAnsi="方正黑体_GBK" w:eastAsia="方正黑体_GBK" w:cs="方正黑体_GBK"/>
+          <w:sz w:val="32"/>
+          <w:szCs w:val="32"/>
+        </w:rPr>
         <w:t>六、教学实施建议</w:t>
       </w:r>
       <w:bookmarkEnd w:id="11"/>
@@ -9755,6 +9815,11 @@
       </w:pPr>
       <w:bookmarkStart w:id="12" w:name="_Toc241007385"/>
       <w:r>
+        <w:rPr>
+          <w:rFonts w:ascii="方正楷体_GBK" w:hAnsi="方正楷体_GBK" w:eastAsia="方正楷体_GBK" w:cs="方正楷体_GBK"/>
+          <w:sz w:val="32"/>
+          <w:szCs w:val="32"/>
+        </w:rPr>
         <w:t>（一）师资队伍要求</w:t>
       </w:r>
       <w:bookmarkEnd w:id="12"/>
@@ -9968,6 +10033,11 @@
       </w:pPr>
       <w:bookmarkStart w:id="13" w:name="_Toc241007386"/>
       <w:r>
+        <w:rPr>
+          <w:rFonts w:ascii="方正楷体_GBK" w:hAnsi="方正楷体_GBK" w:eastAsia="方正楷体_GBK" w:cs="方正楷体_GBK"/>
+          <w:sz w:val="32"/>
+          <w:szCs w:val="32"/>
+        </w:rPr>
         <w:t>（二）教学设施与环境</w:t>
       </w:r>
       <w:bookmarkEnd w:id="13"/>
@@ -10379,6 +10449,11 @@
       </w:pPr>
       <w:bookmarkStart w:id="14" w:name="_Toc241007387"/>
       <w:r>
+        <w:rPr>
+          <w:rFonts w:ascii="方正楷体_GBK" w:hAnsi="方正楷体_GBK" w:eastAsia="方正楷体_GBK" w:cs="方正楷体_GBK"/>
+          <w:sz w:val="32"/>
+          <w:szCs w:val="32"/>
+        </w:rPr>
         <w:t>（三）教材与教学资源</w:t>
       </w:r>
       <w:bookmarkEnd w:id="14"/>
@@ -10708,6 +10783,11 @@
       </w:pPr>
       <w:bookmarkStart w:id="15" w:name="_Toc241007388"/>
       <w:r>
+        <w:rPr>
+          <w:rFonts w:ascii="方正楷体_GBK" w:hAnsi="方正楷体_GBK" w:eastAsia="方正楷体_GBK" w:cs="方正楷体_GBK"/>
+          <w:sz w:val="32"/>
+          <w:szCs w:val="32"/>
+        </w:rPr>
         <w:t>（四）教学手段与方法</w:t>
       </w:r>
       <w:bookmarkEnd w:id="15"/>
@@ -12573,6 +12653,11 @@
       </w:pPr>
       <w:bookmarkStart w:id="16" w:name="_Toc241007389"/>
       <w:r>
+        <w:rPr>
+          <w:rFonts w:ascii="方正楷体_GBK" w:hAnsi="方正楷体_GBK" w:eastAsia="方正楷体_GBK" w:cs="方正楷体_GBK"/>
+          <w:sz w:val="32"/>
+          <w:szCs w:val="32"/>
+        </w:rPr>
         <w:t>（五）考核与评价（结合课程实际进行设计）</w:t>
       </w:r>
       <w:bookmarkEnd w:id="16"/>
@@ -14216,6 +14301,11 @@
       </w:pPr>
       <w:bookmarkStart w:id="17" w:name="_Toc241007390"/>
       <w:r>
+        <w:rPr>
+          <w:rFonts w:ascii="方正黑体_GBK" w:hAnsi="方正黑体_GBK" w:eastAsia="方正黑体_GBK" w:cs="方正黑体_GBK"/>
+          <w:sz w:val="32"/>
+          <w:szCs w:val="32"/>
+        </w:rPr>
         <w:t>七、课程思政元素挖掘（可选独立章节）</w:t>
       </w:r>
       <w:bookmarkEnd w:id="17"/>
@@ -16237,6 +16327,11 @@
       </w:pPr>
       <w:bookmarkStart w:id="18" w:name="_Toc241007391"/>
       <w:r>
+        <w:rPr>
+          <w:rFonts w:ascii="方正黑体_GBK" w:hAnsi="方正黑体_GBK" w:eastAsia="方正黑体_GBK" w:cs="方正黑体_GBK"/>
+          <w:sz w:val="32"/>
+          <w:szCs w:val="32"/>
+        </w:rPr>
         <w:t>八、编制说明</w:t>
       </w:r>
       <w:bookmarkEnd w:id="18"/>

</xml_diff>